<commit_message>
TE6: audit fixes (distractor origin, summary wording, unrevealing tower sketches, moulding method, CheckIt phrasing), audit notes, README row
Co-Authored-By: Claude Opus 5.5 <noreply@anthropic.com>
Claude-Session: https://claude.ai/code/session_013Y8PfETWcMLvmUEpCdE8Wq
</commit_message>
<xml_diff>
--- a/support-materials/TE6/TE6_worked_examples.docx
+++ b/support-materials/TE6/TE6_worked_examples.docx
@@ -311,7 +311,7 @@
         <w:t xml:space="preserve">°</w:t>
       </w:r>
       <w:r>
-        <w:t xml:space="preserve">. </w:t>
+        <w:t xml:space="preserve">. The answers 50° and 130° start from 90°, but nothing in the picture is a right angle. </w:t>
       </w:r>
       <w:r>
         <w:rPr>
@@ -494,7 +494,7 @@
         <w:spacing w:after="120" w:before="80" w:line="300"/>
       </w:pPr>
       <w:r>
-        <w:t xml:space="preserve">An angle of depression is measured down from the horizontal. The horizontal line at the top is parallel to the water, so the line of sight cuts both at the same angle: the angle at the boat is also 20°. The 70° is the angle at the top between the cliff face and the line of sight. </w:t>
+        <w:t xml:space="preserve">An angle of depression is measured down from the horizontal. The horizontal line at the top is parallel to the water, so the line of sight cuts both at the same angle: the angle at the boat is also 20°. The 70° is the angle at the top between the cliff face and the line of sight, and 90° is where the cliff meets the water. </w:t>
       </w:r>
       <w:r>
         <w:rPr>
@@ -725,7 +725,7 @@
         <w:t xml:space="preserve">°</w:t>
       </w:r>
       <w:r>
-        <w:t xml:space="preserve">. Adding them, 175°, measures nothing in the picture. If the difference is ever more than 180°, the angle between the paths is 360° minus it. </w:t>
+        <w:t xml:space="preserve">. Adding them, 175°, measures nothing in the picture. The answer 75° is 180° minus the difference, and 35° is just the first heading. If the difference is ever more than 180°, the angle between the paths is 360° minus it. </w:t>
       </w:r>
       <w:r>
         <w:rPr>
@@ -1937,7 +1937,7 @@
         <w:spacing w:after="120" w:before="80" w:line="300"/>
       </w:pPr>
       <w:r>
-        <w:t xml:space="preserve">Two fire towers are 30 miles apart. Ranger Carla sees the fire at 55° from the other tower, and Ranger Dev sees it at 62° from the other tower. Which ranger is the shorter distance from the fire, and how far away is that ranger?</w:t>
+        <w:t xml:space="preserve">Two fire towers are 30 miles apart. Ranger Carla sees the fire 55° to the left of the other tower, and Ranger Dev sees it 62° to the right of the other tower. Which ranger is the shorter distance from the fire, and how far away is that ranger?</w:t>
       </w:r>
     </w:p>
     <w:p>
@@ -2444,14 +2444,74 @@
         <w:t xml:space="preserve">)≈ 17.9</w:t>
       </w:r>
       <w:r>
-        <w:t xml:space="preserve"> m. The answer 14.6 is Hani's distance. The answer 14.1 uses the 10 m depth, which is extra information here, and 16.3 divides by 60° instead of 75°. </w:t>
-      </w:r>
-      <w:r>
-        <w:rPr>
-          <w:b/>
-          <w:bCs/>
-        </w:rPr>
-        <w:t xml:space="preserve">About 17.9 m.</w:t>
+        <w:t xml:space="preserve"> m. The answer 14.6 is Hani's distance. The answer 14.1 uses the 10 m depth, which is extra information here, and 16.3 comes from </w:t>
+      </w:r>
+      <w:r>
+        <w:rPr>
+          <w:i/>
+          <w:iCs/>
+        </w:rPr>
+        <w:t xml:space="preserve">(20</w:t>
+      </w:r>
+      <w:r>
+        <w:t xml:space="preserve">sin</w:t>
+      </w:r>
+      <w:r>
+        <w:rPr>
+          <w:i/>
+          <w:iCs/>
+        </w:rPr>
+        <w:t xml:space="preserve"> 45</w:t>
+      </w:r>
+      <w:r>
+        <w:rPr>
+          <w:i/>
+          <w:iCs/>
+          <w:vertAlign w:val="superscript"/>
+        </w:rPr>
+        <w:t xml:space="preserve">°</w:t>
+      </w:r>
+      <w:r>
+        <w:rPr>
+          <w:i/>
+          <w:iCs/>
+        </w:rPr>
+        <w:t xml:space="preserve">)/(</w:t>
+      </w:r>
+      <w:r>
+        <w:t xml:space="preserve">sin</w:t>
+      </w:r>
+      <w:r>
+        <w:rPr>
+          <w:i/>
+          <w:iCs/>
+        </w:rPr>
+        <w:t xml:space="preserve"> 60</w:t>
+      </w:r>
+      <w:r>
+        <w:rPr>
+          <w:i/>
+          <w:iCs/>
+          <w:vertAlign w:val="superscript"/>
+        </w:rPr>
+        <w:t xml:space="preserve">°</w:t>
+      </w:r>
+      <w:r>
+        <w:rPr>
+          <w:i/>
+          <w:iCs/>
+        </w:rPr>
+        <w:t xml:space="preserve">)</w:t>
+      </w:r>
+      <w:r>
+        <w:t xml:space="preserve">, which pairs the angles with the wrong sides. CheckIt asks for both divers: Hani is about 14.6 m away. </w:t>
+      </w:r>
+      <w:r>
+        <w:rPr>
+          <w:b/>
+          <w:bCs/>
+        </w:rPr>
+        <w:t xml:space="preserve">Eva is about 17.9 m from the turtle.</w:t>
       </w:r>
     </w:p>
     <w:p>
@@ -2927,7 +2987,97 @@
         <w:spacing w:after="120" w:before="80" w:line="300"/>
       </w:pPr>
       <w:r>
-        <w:t xml:space="preserve">The two 3 in sides are equal, so the other two angles are equal: each is </w:t>
+        <w:t xml:space="preserve">You know two sides and the angle between them, so use the law of cosines: </w:t>
+      </w:r>
+      <w:r>
+        <w:rPr>
+          <w:i/>
+          <w:iCs/>
+        </w:rPr>
+        <w:t xml:space="preserve">w</w:t>
+      </w:r>
+      <w:r>
+        <w:rPr>
+          <w:i/>
+          <w:iCs/>
+          <w:vertAlign w:val="superscript"/>
+        </w:rPr>
+        <w:t xml:space="preserve">2</w:t>
+      </w:r>
+      <w:r>
+        <w:rPr>
+          <w:i/>
+          <w:iCs/>
+        </w:rPr>
+        <w:t xml:space="preserve">=3</w:t>
+      </w:r>
+      <w:r>
+        <w:rPr>
+          <w:i/>
+          <w:iCs/>
+          <w:vertAlign w:val="superscript"/>
+        </w:rPr>
+        <w:t xml:space="preserve">2</w:t>
+      </w:r>
+      <w:r>
+        <w:rPr>
+          <w:i/>
+          <w:iCs/>
+        </w:rPr>
+        <w:t xml:space="preserve">+3</w:t>
+      </w:r>
+      <w:r>
+        <w:rPr>
+          <w:i/>
+          <w:iCs/>
+          <w:vertAlign w:val="superscript"/>
+        </w:rPr>
+        <w:t xml:space="preserve">2</w:t>
+      </w:r>
+      <w:r>
+        <w:rPr>
+          <w:i/>
+          <w:iCs/>
+        </w:rPr>
+        <w:t xml:space="preserve">−2(3)(3)</w:t>
+      </w:r>
+      <w:r>
+        <w:t xml:space="preserve">cos</w:t>
+      </w:r>
+      <w:r>
+        <w:rPr>
+          <w:i/>
+          <w:iCs/>
+        </w:rPr>
+        <w:t xml:space="preserve"> 92</w:t>
+      </w:r>
+      <w:r>
+        <w:rPr>
+          <w:i/>
+          <w:iCs/>
+          <w:vertAlign w:val="superscript"/>
+        </w:rPr>
+        <w:t xml:space="preserve">°</w:t>
+      </w:r>
+      <w:r>
+        <w:rPr>
+          <w:i/>
+          <w:iCs/>
+        </w:rPr>
+        <w:t xml:space="preserve">≈ 18.63</w:t>
+      </w:r>
+      <w:r>
+        <w:t xml:space="preserve">, and </w:t>
+      </w:r>
+      <w:r>
+        <w:rPr>
+          <w:i/>
+          <w:iCs/>
+        </w:rPr>
+        <w:t xml:space="preserve">w≈ 4.32</w:t>
+      </w:r>
+      <w:r>
+        <w:t xml:space="preserve"> in. CheckIt's key uses the law of sines instead: the other two angles are equal, each </w:t>
       </w:r>
       <w:r>
         <w:rPr>
@@ -2975,7 +3125,7 @@
         <w:t xml:space="preserve">°</w:t>
       </w:r>
       <w:r>
-        <w:t xml:space="preserve">. The width is across from the 92° angle: </w:t>
+        <w:t xml:space="preserve">, so </w:t>
       </w:r>
       <w:r>
         <w:rPr>
@@ -3032,83 +3182,10 @@
           <w:i/>
           <w:iCs/>
         </w:rPr>
-        <w:t xml:space="preserve">)≈ 4.32</w:t>
-      </w:r>
-      <w:r>
-        <w:t xml:space="preserve"> in. The law of cosines gives the same answer: </w:t>
-      </w:r>
-      <w:r>
-        <w:rPr>
-          <w:i/>
-          <w:iCs/>
-        </w:rPr>
-        <w:t xml:space="preserve">w</w:t>
-      </w:r>
-      <w:r>
-        <w:rPr>
-          <w:i/>
-          <w:iCs/>
-          <w:vertAlign w:val="superscript"/>
-        </w:rPr>
-        <w:t xml:space="preserve">2</w:t>
-      </w:r>
-      <w:r>
-        <w:rPr>
-          <w:i/>
-          <w:iCs/>
-        </w:rPr>
-        <w:t xml:space="preserve">=3</w:t>
-      </w:r>
-      <w:r>
-        <w:rPr>
-          <w:i/>
-          <w:iCs/>
-          <w:vertAlign w:val="superscript"/>
-        </w:rPr>
-        <w:t xml:space="preserve">2</w:t>
-      </w:r>
-      <w:r>
-        <w:rPr>
-          <w:i/>
-          <w:iCs/>
-        </w:rPr>
-        <w:t xml:space="preserve">+3</w:t>
-      </w:r>
-      <w:r>
-        <w:rPr>
-          <w:i/>
-          <w:iCs/>
-          <w:vertAlign w:val="superscript"/>
-        </w:rPr>
-        <w:t xml:space="preserve">2</w:t>
-      </w:r>
-      <w:r>
-        <w:rPr>
-          <w:i/>
-          <w:iCs/>
-        </w:rPr>
-        <w:t xml:space="preserve">−2(3)(3)</w:t>
-      </w:r>
-      <w:r>
-        <w:t xml:space="preserve">cos</w:t>
-      </w:r>
-      <w:r>
-        <w:rPr>
-          <w:i/>
-          <w:iCs/>
-        </w:rPr>
-        <w:t xml:space="preserve"> 92</w:t>
-      </w:r>
-      <w:r>
-        <w:rPr>
-          <w:i/>
-          <w:iCs/>
-          <w:vertAlign w:val="superscript"/>
-        </w:rPr>
-        <w:t xml:space="preserve">°</w:t>
-      </w:r>
-      <w:r>
-        <w:t xml:space="preserve">. The answer 4.24 assumes a 90° corner, 2.09 flips the ratio, and 6 adds the sides. </w:t>
+        <w:t xml:space="preserve">)</w:t>
+      </w:r>
+      <w:r>
+        <w:t xml:space="preserve">, the same answer. The answer 4.24 assumes a 90° corner, 2.09 flips the ratio, and 6 adds the sides. </w:t>
       </w:r>
       <w:r>
         <w:rPr>

</xml_diff>